<commit_message>
added database and made code compatable with it
</commit_message>
<xml_diff>
--- a/Early_Alzheimer_Detection_Model_Report.docx
+++ b/Early_Alzheimer_Detection_Model_Report.docx
@@ -29,7 +29,7 @@
                     </pic:cNvPicPr>
                   </pic:nvPicPr>
                   <pic:blipFill>
-                    <a:blip r:embed="rId7"/>
+                    <a:blip r:embed="rId8"/>
                     <a:srcRect/>
                     <a:stretch>
                       <a:fillRect/>
@@ -277,7 +277,7 @@
                     </pic:cNvPicPr>
                   </pic:nvPicPr>
                   <pic:blipFill>
-                    <a:blip r:embed="rId7"/>
+                    <a:blip r:embed="rId8"/>
                     <a:srcRect/>
                     <a:stretch>
                       <a:fillRect/>
@@ -649,7 +649,7 @@
                     </pic:cNvPicPr>
                   </pic:nvPicPr>
                   <pic:blipFill>
-                    <a:blip r:embed="rId7"/>
+                    <a:blip r:embed="rId8"/>
                     <a:srcRect/>
                     <a:stretch>
                       <a:fillRect/>
@@ -813,7 +813,7 @@
                     </pic:cNvPicPr>
                   </pic:nvPicPr>
                   <pic:blipFill>
-                    <a:blip r:embed="rId7"/>
+                    <a:blip r:embed="rId8"/>
                     <a:srcRect/>
                     <a:stretch>
                       <a:fillRect/>
@@ -1472,7 +1472,7 @@
     <w:p>
       <w:pPr>
         <w:sectPr>
-          <w:footerReference w:type="default" r:id="rId8"/>
+          <w:footerReference w:type="default" r:id="rId9"/>
           <w:pgSz w:w="11906" w:h="16838"/>
           <w:pgMar w:top="1440" w:right="1440" w:bottom="1440" w:left="2160" w:header="708" w:footer="708" w:gutter="0"/>
           <w:cols w:space="720"/>
@@ -2746,6 +2746,41 @@
     </w:p>
     <w:p>
       <w:pPr>
+        <w:spacing w:after="160" w:line="360" w:lineRule="auto"/>
+        <w:jc w:val="both"/>
+      </w:pPr>
+      <w:r>
+        <w:t xml:space="preserve">[1] </w:t>
+      </w:r>
+      <w:sdt>
+        <w:sdtPr>
+          <w:id w:val="1124739644"/>
+          <w:citation/>
+        </w:sdtPr>
+        <w:sdtContent>
+          <w:r>
+            <w:fldChar w:fldCharType="begin"/>
+          </w:r>
+          <w:r>
+            <w:instrText xml:space="preserve"> CITATION Placeholder1 \l 16393 </w:instrText>
+          </w:r>
+          <w:r>
+            <w:fldChar w:fldCharType="separate"/>
+          </w:r>
+          <w:r>
+            <w:rPr>
+              <w:noProof/>
+            </w:rPr>
+            <w:t>(Placeholder1)</w:t>
+          </w:r>
+          <w:r>
+            <w:fldChar w:fldCharType="end"/>
+          </w:r>
+        </w:sdtContent>
+      </w:sdt>
+    </w:p>
+    <w:p>
+      <w:pPr>
         <w:pStyle w:val="Heading2"/>
         <w:spacing w:before="300" w:after="160"/>
       </w:pPr>
@@ -2858,11 +2893,11 @@
       </w:r>
       <w:proofErr w:type="spellEnd"/>
       <w:r>
-        <w:t xml:space="preserve"> was selected over deep learning approaches because tabular biomarker data of this size and dimensionality (10,000 rows × 51 features) is well suited to gradient-boosted trees, which typically outperform deep </w:t>
+        <w:t xml:space="preserve"> was selected over deep learning approaches </w:t>
       </w:r>
       <w:r>
         <w:lastRenderedPageBreak/>
-        <w:t>neural networks on structured/tabular data and are inherently easier to interpret via feature importance and SHAP (</w:t>
+        <w:t>because tabular biomarker data of this size and dimensionality (10,000 rows × 51 features) is well suited to gradient-boosted trees, which typically outperform deep neural networks on structured/tabular data and are inherently easier to interpret via feature importance and SHAP (</w:t>
       </w:r>
       <w:proofErr w:type="spellStart"/>
       <w:r>
@@ -8938,8 +8973,18 @@
         <w:t>Dayananda Sagar University, School of Computer Applications — MCA Project Report Format Guidelines.</w:t>
       </w:r>
     </w:p>
+    <w:p>
+      <w:pPr>
+        <w:pStyle w:val="ListParagraph"/>
+        <w:numPr>
+          <w:ilvl w:val="0"/>
+          <w:numId w:val="3"/>
+        </w:numPr>
+        <w:spacing w:after="100" w:line="360" w:lineRule="auto"/>
+      </w:pPr>
+    </w:p>
     <w:sectPr>
-      <w:footerReference w:type="default" r:id="rId9"/>
+      <w:footerReference w:type="default" r:id="rId10"/>
       <w:pgSz w:w="11906" w:h="16838"/>
       <w:pgMar w:top="1440" w:right="1440" w:bottom="1440" w:left="2160" w:header="708" w:footer="708" w:gutter="0"/>
       <w:cols w:space="720"/>
@@ -10206,4 +10251,23 @@
     </a:ext>
   </a:extLst>
 </a:theme>
+</file>
+
+<file path=customXml/item1.xml><?xml version="1.0" encoding="utf-8"?>
+<b:Sources xmlns:b="http://schemas.openxmlformats.org/officeDocument/2006/bibliography" xmlns="http://schemas.openxmlformats.org/officeDocument/2006/bibliography" SelectedStyle="\APASixthEditionOfficeOnline.xsl" StyleName="APA" Version="6">
+  <b:Source>
+    <b:Tag>Placeholder1</b:Tag>
+    <b:SourceType>Book</b:SourceType>
+    <b:Guid>{DCB67D91-937B-4AA7-9688-E7F1CD82DDA0}</b:Guid>
+    <b:RefOrder>1</b:RefOrder>
+  </b:Source>
+</b:Sources>
+</file>
+
+<file path=customXml/itemProps1.xml><?xml version="1.0" encoding="utf-8"?>
+<ds:datastoreItem xmlns:ds="http://schemas.openxmlformats.org/officeDocument/2006/customXml" ds:itemID="{F8A0CB5D-21F6-4D29-86A2-D0E5ED6F0EEC}">
+  <ds:schemaRefs>
+    <ds:schemaRef ds:uri="http://schemas.openxmlformats.org/officeDocument/2006/bibliography"/>
+  </ds:schemaRefs>
+</ds:datastoreItem>
 </file>
</xml_diff>